<commit_message>
Black text in ddanish release notes
</commit_message>
<xml_diff>
--- a/Documentation/Official Documentation/Release Notes/Release Notes for IBOS Nodelæser version 4.0.0.0.docx
+++ b/Documentation/Official Documentation/Release Notes/Release Notes for IBOS Nodelæser version 4.0.0.0.docx
@@ -7,37 +7,46 @@
         <w:pStyle w:val="Overskrift"/>
         <w:bidi w:val="0"/>
         <w:spacing w:before="240" w:after="120"/>
-        <w:rPr/>
-      </w:pPr>
-      <w:r>
-        <w:rPr/>
+        <w:rPr>
+          <w:color w:val="000000"/>
+        </w:rPr>
+      </w:pPr>
+      <w:r>
+        <w:rPr>
+          <w:color w:val="000000"/>
+        </w:rPr>
         <w:t xml:space="preserve">Release Notes for IBOS Nodelæser Version </w:t>
       </w:r>
       <w:r>
         <w:rPr>
-          <w:color w:val="C9211E"/>
+          <w:color w:val="000000"/>
           <w:lang w:val="da-DK"/>
         </w:rPr>
         <w:t>4</w:t>
       </w:r>
       <w:r>
         <w:rPr>
-          <w:color w:val="C9211E"/>
+          <w:color w:val="000000"/>
         </w:rPr>
         <w:t>.</w:t>
       </w:r>
       <w:r>
-        <w:rPr/>
+        <w:rPr>
+          <w:color w:val="000000"/>
+        </w:rPr>
         <w:t>0.</w:t>
       </w:r>
       <w:r>
         <w:rPr>
+          <w:color w:val="000000"/>
           <w:lang w:val="da-DK"/>
         </w:rPr>
         <w:t>0</w:t>
       </w:r>
       <w:r>
-        <w:rPr/>
+        <w:rPr>
+          <w:color w:val="000000"/>
+        </w:rPr>
         <w:t>.0</w:t>
       </w:r>
     </w:p>
@@ -49,10 +58,14 @@
         <w:bidi w:val="0"/>
         <w:jc w:val="left"/>
         <w:textAlignment w:val="baseline"/>
-        <w:rPr/>
-      </w:pPr>
-      <w:r>
-        <w:rPr/>
+        <w:rPr>
+          <w:color w:val="000000"/>
+        </w:rPr>
+      </w:pPr>
+      <w:r>
+        <w:rPr>
+          <w:color w:val="000000"/>
+        </w:rPr>
       </w:r>
     </w:p>
     <w:p>
@@ -63,10 +76,14 @@
         <w:bidi w:val="0"/>
         <w:jc w:val="left"/>
         <w:textAlignment w:val="baseline"/>
-        <w:rPr/>
-      </w:pPr>
-      <w:r>
-        <w:rPr/>
+        <w:rPr>
+          <w:color w:val="000000"/>
+        </w:rPr>
+      </w:pPr>
+      <w:r>
+        <w:rPr>
+          <w:color w:val="000000"/>
+        </w:rPr>
       </w:r>
     </w:p>
     <w:p>
@@ -79,18 +96,21 @@
         <w:bidi w:val="0"/>
         <w:jc w:val="left"/>
         <w:outlineLvl w:val="0"/>
-        <w:rPr/>
+        <w:rPr>
+          <w:color w:val="000000"/>
+        </w:rPr>
       </w:pPr>
       <w:r>
         <w:rPr>
           <w:b/>
+          <w:color w:val="000000"/>
         </w:rPr>
         <w:t xml:space="preserve">Rettelser og tilføjelser i forhold til IBOS Nodelæser version </w:t>
       </w:r>
       <w:r>
         <w:rPr>
           <w:b/>
-          <w:color w:val="C9211E"/>
+          <w:color w:val="000000"/>
           <w:lang w:val="da-DK"/>
         </w:rPr>
         <w:t>3</w:t>
@@ -98,13 +118,14 @@
       <w:r>
         <w:rPr>
           <w:b/>
-          <w:color w:val="C9211E"/>
+          <w:color w:val="000000"/>
         </w:rPr>
         <w:t>.</w:t>
       </w:r>
       <w:r>
         <w:rPr>
           <w:b/>
+          <w:color w:val="000000"/>
         </w:rPr>
         <w:t>0.0.0</w:t>
       </w:r>
@@ -117,11 +138,13 @@
         <w:rPr>
           <w:b/>
           <w:b/>
+          <w:color w:val="000000"/>
         </w:rPr>
       </w:pPr>
       <w:r>
         <w:rPr>
           <w:b/>
+          <w:color w:val="000000"/>
         </w:rPr>
       </w:r>
     </w:p>
@@ -133,11 +156,13 @@
         <w:rPr>
           <w:b/>
           <w:b/>
+          <w:color w:val="000000"/>
         </w:rPr>
       </w:pPr>
       <w:r>
         <w:rPr>
           <w:b/>
+          <w:color w:val="000000"/>
         </w:rPr>
       </w:r>
     </w:p>
@@ -160,6 +185,7 @@
         <w:rPr>
           <w:b w:val="false"/>
           <w:bCs w:val="false"/>
+          <w:color w:val="000000"/>
         </w:rPr>
         <w:t>Eksport af punktnoder i BANA 2015 format inklusive intervalnotation og bistemmer</w:t>
       </w:r>
@@ -178,12 +204,14 @@
           <w:b w:val="false"/>
           <w:b w:val="false"/>
           <w:bCs w:val="false"/>
-        </w:rPr>
-      </w:pPr>
-      <w:r>
-        <w:rPr>
-          <w:b w:val="false"/>
-          <w:bCs w:val="false"/>
+          <w:color w:val="000000"/>
+        </w:rPr>
+      </w:pPr>
+      <w:r>
+        <w:rPr>
+          <w:b w:val="false"/>
+          <w:bCs w:val="false"/>
+          <w:color w:val="000000"/>
         </w:rPr>
       </w:r>
     </w:p>
@@ -206,6 +234,7 @@
         <w:rPr>
           <w:b w:val="false"/>
           <w:bCs w:val="false"/>
+          <w:color w:val="000000"/>
         </w:rPr>
         <w:t>Et nyt ”profil” begreb tillader brugeren at opsætte egenskaber for sine personlige punktprintere og notatapparater én gang for alle.</w:t>
       </w:r>
@@ -219,12 +248,14 @@
           <w:b w:val="false"/>
           <w:b w:val="false"/>
           <w:bCs w:val="false"/>
-        </w:rPr>
-      </w:pPr>
-      <w:r>
-        <w:rPr>
-          <w:b w:val="false"/>
-          <w:bCs w:val="false"/>
+          <w:color w:val="000000"/>
+        </w:rPr>
+      </w:pPr>
+      <w:r>
+        <w:rPr>
+          <w:b w:val="false"/>
+          <w:bCs w:val="false"/>
+          <w:color w:val="000000"/>
         </w:rPr>
       </w:r>
     </w:p>
@@ -247,6 +278,7 @@
         <w:rPr>
           <w:b w:val="false"/>
           <w:bCs w:val="false"/>
+          <w:color w:val="000000"/>
         </w:rPr>
         <w:t>Udvidet understøttelse af punktnoder for SATB korarrangementer i form af generering af en højrehåndsstemme for Sopran og Alt samt en venstrehåndsstemme for Bas og Tenor.</w:t>
       </w:r>
@@ -260,12 +292,14 @@
           <w:b w:val="false"/>
           <w:b w:val="false"/>
           <w:bCs w:val="false"/>
-        </w:rPr>
-      </w:pPr>
-      <w:r>
-        <w:rPr>
-          <w:b w:val="false"/>
-          <w:bCs w:val="false"/>
+          <w:color w:val="000000"/>
+        </w:rPr>
+      </w:pPr>
+      <w:r>
+        <w:rPr>
+          <w:b w:val="false"/>
+          <w:bCs w:val="false"/>
+          <w:color w:val="000000"/>
         </w:rPr>
       </w:r>
     </w:p>
@@ -288,6 +322,7 @@
         <w:rPr>
           <w:b w:val="false"/>
           <w:bCs w:val="false"/>
+          <w:color w:val="000000"/>
         </w:rPr>
         <w:t xml:space="preserve">Direkte udskrivning af genererede punktnoder på punktprinter ved hjælp af Windows standard Printer-dialog. </w:t>
       </w:r>
@@ -297,6 +332,7 @@
         <w:rPr>
           <w:b w:val="false"/>
           <w:bCs w:val="false"/>
+          <w:color w:val="000000"/>
         </w:rPr>
         <w:t xml:space="preserve"> Bør foretrækkes, hvis punktprinteren kan registreres som en Windows-printer.</w:t>
       </w:r>
@@ -310,12 +346,14 @@
           <w:b w:val="false"/>
           <w:b w:val="false"/>
           <w:bCs w:val="false"/>
-        </w:rPr>
-      </w:pPr>
-      <w:r>
-        <w:rPr>
-          <w:b w:val="false"/>
-          <w:bCs w:val="false"/>
+          <w:color w:val="000000"/>
+        </w:rPr>
+      </w:pPr>
+      <w:r>
+        <w:rPr>
+          <w:b w:val="false"/>
+          <w:bCs w:val="false"/>
+          <w:color w:val="000000"/>
         </w:rPr>
       </w:r>
     </w:p>
@@ -338,6 +376,7 @@
         <w:rPr>
           <w:b w:val="false"/>
           <w:bCs w:val="false"/>
+          <w:color w:val="000000"/>
         </w:rPr>
         <w:t>Indirekte udskrivning af genererede punknoder via punktprinter-leverandørens eget udskrivningsprogram.  Kan bruges som en nødløsning, hvis punktprinteren IKKE kan registreres som en Windows-printer.</w:t>
       </w:r>
@@ -351,12 +390,14 @@
           <w:b w:val="false"/>
           <w:b w:val="false"/>
           <w:bCs w:val="false"/>
-        </w:rPr>
-      </w:pPr>
-      <w:r>
-        <w:rPr>
-          <w:b w:val="false"/>
-          <w:bCs w:val="false"/>
+          <w:color w:val="000000"/>
+        </w:rPr>
+      </w:pPr>
+      <w:r>
+        <w:rPr>
+          <w:b w:val="false"/>
+          <w:bCs w:val="false"/>
+          <w:color w:val="000000"/>
         </w:rPr>
       </w:r>
     </w:p>
@@ -379,6 +420,7 @@
         <w:rPr>
           <w:b w:val="false"/>
           <w:bCs w:val="false"/>
+          <w:color w:val="000000"/>
         </w:rPr>
         <w:t>Hjælp til kopiering af genererede punktnoder til notatapparat ved hjælp af Windows Stifinder.</w:t>
       </w:r>
@@ -392,12 +434,14 @@
           <w:b w:val="false"/>
           <w:b w:val="false"/>
           <w:bCs w:val="false"/>
-        </w:rPr>
-      </w:pPr>
-      <w:r>
-        <w:rPr>
-          <w:b w:val="false"/>
-          <w:bCs w:val="false"/>
+          <w:color w:val="000000"/>
+        </w:rPr>
+      </w:pPr>
+      <w:r>
+        <w:rPr>
+          <w:b w:val="false"/>
+          <w:bCs w:val="false"/>
+          <w:color w:val="000000"/>
         </w:rPr>
       </w:r>
     </w:p>
@@ -420,6 +464,7 @@
         <w:rPr>
           <w:b w:val="false"/>
           <w:bCs w:val="false"/>
+          <w:color w:val="000000"/>
         </w:rPr>
         <w:t>Mulighed for bruger-specifik opsætning af af stier til standard nodeprogrammer ”MuseScore”, ”Sibelius”, ”Finale Notepad” og ”Capella”.</w:t>
       </w:r>
@@ -433,12 +478,14 @@
           <w:b w:val="false"/>
           <w:b w:val="false"/>
           <w:bCs w:val="false"/>
-        </w:rPr>
-      </w:pPr>
-      <w:r>
-        <w:rPr>
-          <w:b w:val="false"/>
-          <w:bCs w:val="false"/>
+          <w:color w:val="000000"/>
+        </w:rPr>
+      </w:pPr>
+      <w:r>
+        <w:rPr>
+          <w:b w:val="false"/>
+          <w:bCs w:val="false"/>
+          <w:color w:val="000000"/>
         </w:rPr>
       </w:r>
     </w:p>
@@ -461,6 +508,7 @@
         <w:rPr>
           <w:b w:val="false"/>
           <w:bCs w:val="false"/>
+          <w:color w:val="000000"/>
         </w:rPr>
         <w:t>Mulighed for bruger-specifik opsætning af sti til leverandørspecifikt udskrivningsprogram for punktnoder.</w:t>
       </w:r>
@@ -474,12 +522,14 @@
           <w:b w:val="false"/>
           <w:b w:val="false"/>
           <w:bCs w:val="false"/>
-        </w:rPr>
-      </w:pPr>
-      <w:r>
-        <w:rPr>
-          <w:b w:val="false"/>
-          <w:bCs w:val="false"/>
+          <w:color w:val="000000"/>
+        </w:rPr>
+      </w:pPr>
+      <w:r>
+        <w:rPr>
+          <w:b w:val="false"/>
+          <w:bCs w:val="false"/>
+          <w:color w:val="000000"/>
         </w:rPr>
       </w:r>
     </w:p>
@@ -502,6 +552,7 @@
         <w:rPr>
           <w:b w:val="false"/>
           <w:bCs w:val="false"/>
+          <w:color w:val="000000"/>
         </w:rPr>
         <w:t>Bruger-specifik, automatisk gemning af sti til senest åbnede MusicXml fil og til senest genererede punktnodefiler.</w:t>
       </w:r>
@@ -515,12 +566,14 @@
           <w:b w:val="false"/>
           <w:b w:val="false"/>
           <w:bCs w:val="false"/>
-        </w:rPr>
-      </w:pPr>
-      <w:r>
-        <w:rPr>
-          <w:b w:val="false"/>
-          <w:bCs w:val="false"/>
+          <w:color w:val="000000"/>
+        </w:rPr>
+      </w:pPr>
+      <w:r>
+        <w:rPr>
+          <w:b w:val="false"/>
+          <w:bCs w:val="false"/>
+          <w:color w:val="000000"/>
         </w:rPr>
       </w:r>
     </w:p>
@@ -543,6 +596,7 @@
         <w:rPr>
           <w:b w:val="false"/>
           <w:bCs w:val="false"/>
+          <w:color w:val="000000"/>
         </w:rPr>
         <w:t>Forbedret funktionalitet af ”Fuld Taktinformation” (også kaldet ”hvor er jeg funktionen”) som nu både viser taktnummer og slagnummer inden for takten.</w:t>
       </w:r>
@@ -561,12 +615,14 @@
           <w:b w:val="false"/>
           <w:b w:val="false"/>
           <w:bCs w:val="false"/>
-        </w:rPr>
-      </w:pPr>
-      <w:r>
-        <w:rPr>
-          <w:b w:val="false"/>
-          <w:bCs w:val="false"/>
+          <w:color w:val="000000"/>
+        </w:rPr>
+      </w:pPr>
+      <w:r>
+        <w:rPr>
+          <w:b w:val="false"/>
+          <w:bCs w:val="false"/>
+          <w:color w:val="000000"/>
         </w:rPr>
       </w:r>
     </w:p>
@@ -579,83 +635,46 @@
         </w:numPr>
         <w:bidi w:val="0"/>
         <w:jc w:val="left"/>
-        <w:rPr/>
-      </w:pPr>
-      <w:r>
-        <w:rPr>
-          <w:b w:val="false"/>
-          <w:bCs w:val="false"/>
-        </w:rPr>
-        <w:t xml:space="preserve">Lokalisering til hollandsk: </w:t>
-      </w:r>
-      <w:r>
-        <w:rPr>
-          <w:b w:val="false"/>
-          <w:bCs w:val="false"/>
-        </w:rPr>
-        <w:t>Oversættelse udført af</w:t>
+        <w:rPr>
+          <w:color w:val="000000"/>
+        </w:rPr>
+      </w:pPr>
+      <w:r>
+        <w:rPr>
+          <w:b w:val="false"/>
+          <w:bCs w:val="false"/>
+          <w:color w:val="000000"/>
+        </w:rPr>
+        <w:t>Lokalisering til hollandsk: Oversættelse udført af</w:t>
       </w:r>
       <w:r>
         <w:rPr>
           <w:rFonts w:ascii="Times New Roman" w:hAnsi="Times New Roman"/>
           <w:b w:val="false"/>
           <w:bCs w:val="false"/>
+          <w:color w:val="000000"/>
           <w:sz w:val="24"/>
         </w:rPr>
-        <w:t xml:space="preserve"> Corine </w:t>
-      </w:r>
-      <w:r>
-        <w:rPr>
-          <w:rFonts w:ascii="Times New Roman" w:hAnsi="Times New Roman"/>
-          <w:b w:val="false"/>
-          <w:bCs w:val="false"/>
-          <w:sz w:val="24"/>
-        </w:rPr>
-        <w:t>og</w:t>
-      </w:r>
-      <w:r>
-        <w:rPr>
-          <w:rFonts w:ascii="Times New Roman" w:hAnsi="Times New Roman"/>
-          <w:b w:val="false"/>
-          <w:bCs w:val="false"/>
-          <w:sz w:val="24"/>
-        </w:rPr>
-        <w:t xml:space="preserve"> Bert fr</w:t>
-      </w:r>
-      <w:r>
-        <w:rPr>
-          <w:rFonts w:ascii="Times New Roman" w:hAnsi="Times New Roman"/>
-          <w:b w:val="false"/>
-          <w:bCs w:val="false"/>
-          <w:sz w:val="24"/>
-        </w:rPr>
-        <w:t>a</w:t>
-      </w:r>
-      <w:r>
-        <w:rPr>
-          <w:rFonts w:ascii="Times New Roman" w:hAnsi="Times New Roman"/>
-          <w:b w:val="false"/>
-          <w:bCs w:val="false"/>
-          <w:sz w:val="24"/>
-        </w:rPr>
-        <w:t xml:space="preserve"> Apeldoorn.</w:t>
-      </w:r>
-    </w:p>
-    <w:p>
-      <w:pPr>
-        <w:pStyle w:val="Standard"/>
-        <w:bidi w:val="0"/>
-        <w:jc w:val="left"/>
-        <w:rPr>
-          <w:b w:val="false"/>
-          <w:b w:val="false"/>
-          <w:bCs w:val="false"/>
-        </w:rPr>
-      </w:pPr>
-      <w:r>
-        <w:rPr>
-          <w:b w:val="false"/>
-          <w:bCs w:val="false"/>
+        <w:t xml:space="preserve"> Corine og Bert fra Apeldoorn.</w:t>
+      </w:r>
+    </w:p>
+    <w:p>
+      <w:pPr>
+        <w:pStyle w:val="Standard"/>
+        <w:bidi w:val="0"/>
+        <w:jc w:val="left"/>
+        <w:rPr>
+          <w:b w:val="false"/>
+          <w:b w:val="false"/>
+          <w:bCs w:val="false"/>
+          <w:color w:val="000000"/>
+        </w:rPr>
+      </w:pPr>
+      <w:r>
+        <w:rPr>
+          <w:b w:val="false"/>
+          <w:bCs w:val="false"/>
+          <w:color w:val="000000"/>
         </w:rPr>
       </w:r>
     </w:p>
@@ -678,6 +697,7 @@
         <w:rPr>
           <w:b w:val="false"/>
           <w:bCs w:val="false"/>
+          <w:color w:val="000000"/>
         </w:rPr>
         <w:t>Rettelse af adskillige mindre fejl, rapporteret af brugerne.</w:t>
       </w:r>
@@ -696,12 +716,14 @@
           <w:b w:val="false"/>
           <w:b w:val="false"/>
           <w:bCs w:val="false"/>
-        </w:rPr>
-      </w:pPr>
-      <w:r>
-        <w:rPr>
-          <w:b w:val="false"/>
-          <w:bCs w:val="false"/>
+          <w:color w:val="000000"/>
+        </w:rPr>
+      </w:pPr>
+      <w:r>
+        <w:rPr>
+          <w:b w:val="false"/>
+          <w:bCs w:val="false"/>
+          <w:color w:val="000000"/>
         </w:rPr>
       </w:r>
     </w:p>
@@ -724,6 +746,7 @@
         <w:rPr>
           <w:b w:val="false"/>
           <w:bCs w:val="false"/>
+          <w:color w:val="000000"/>
         </w:rPr>
         <w:t>Tilføjelse af adskillige ekstra faciliteter, ønsket af brugerne.</w:t>
       </w:r>
@@ -737,48 +760,54 @@
           <w:b w:val="false"/>
           <w:b w:val="false"/>
           <w:bCs w:val="false"/>
-        </w:rPr>
-      </w:pPr>
-      <w:r>
-        <w:rPr>
-          <w:b w:val="false"/>
-          <w:bCs w:val="false"/>
-        </w:rPr>
-      </w:r>
-    </w:p>
-    <w:p>
-      <w:pPr>
-        <w:pStyle w:val="Standard"/>
-        <w:bidi w:val="0"/>
-        <w:jc w:val="left"/>
-        <w:rPr>
-          <w:b w:val="false"/>
-          <w:b w:val="false"/>
-          <w:bCs w:val="false"/>
-        </w:rPr>
-      </w:pPr>
-      <w:r>
-        <w:rPr>
-          <w:b w:val="false"/>
-          <w:bCs w:val="false"/>
-        </w:rPr>
-      </w:r>
-    </w:p>
-    <w:p>
-      <w:pPr>
-        <w:pStyle w:val="Standard"/>
-        <w:bidi w:val="0"/>
-        <w:jc w:val="left"/>
-        <w:rPr>
-          <w:b w:val="false"/>
-          <w:b w:val="false"/>
-          <w:bCs w:val="false"/>
-        </w:rPr>
-      </w:pPr>
-      <w:r>
-        <w:rPr>
-          <w:b w:val="false"/>
-          <w:bCs w:val="false"/>
+          <w:color w:val="000000"/>
+        </w:rPr>
+      </w:pPr>
+      <w:r>
+        <w:rPr>
+          <w:b w:val="false"/>
+          <w:bCs w:val="false"/>
+          <w:color w:val="000000"/>
+        </w:rPr>
+      </w:r>
+    </w:p>
+    <w:p>
+      <w:pPr>
+        <w:pStyle w:val="Standard"/>
+        <w:bidi w:val="0"/>
+        <w:jc w:val="left"/>
+        <w:rPr>
+          <w:b w:val="false"/>
+          <w:b w:val="false"/>
+          <w:bCs w:val="false"/>
+          <w:color w:val="000000"/>
+        </w:rPr>
+      </w:pPr>
+      <w:r>
+        <w:rPr>
+          <w:b w:val="false"/>
+          <w:bCs w:val="false"/>
+          <w:color w:val="000000"/>
+        </w:rPr>
+      </w:r>
+    </w:p>
+    <w:p>
+      <w:pPr>
+        <w:pStyle w:val="Standard"/>
+        <w:bidi w:val="0"/>
+        <w:jc w:val="left"/>
+        <w:rPr>
+          <w:b w:val="false"/>
+          <w:b w:val="false"/>
+          <w:bCs w:val="false"/>
+          <w:color w:val="000000"/>
+        </w:rPr>
+      </w:pPr>
+      <w:r>
+        <w:rPr>
+          <w:b w:val="false"/>
+          <w:bCs w:val="false"/>
+          <w:color w:val="000000"/>
         </w:rPr>
       </w:r>
       <w:r>
@@ -794,12 +823,14 @@
           <w:b w:val="false"/>
           <w:b w:val="false"/>
           <w:bCs w:val="false"/>
-        </w:rPr>
-      </w:pPr>
-      <w:r>
-        <w:rPr>
-          <w:b w:val="false"/>
-          <w:bCs w:val="false"/>
+          <w:color w:val="000000"/>
+        </w:rPr>
+      </w:pPr>
+      <w:r>
+        <w:rPr>
+          <w:b w:val="false"/>
+          <w:bCs w:val="false"/>
+          <w:color w:val="000000"/>
         </w:rPr>
       </w:r>
     </w:p>
@@ -814,13 +845,13 @@
         <w:ind w:left="754" w:hanging="0"/>
         <w:jc w:val="left"/>
         <w:rPr>
-          <w:color w:val="729FCF"/>
-          <w:lang w:val="da-DK"/>
-        </w:rPr>
-      </w:pPr>
-      <w:r>
-        <w:rPr>
-          <w:color w:val="729FCF"/>
+          <w:color w:val="000000"/>
+          <w:lang w:val="da-DK"/>
+        </w:rPr>
+      </w:pPr>
+      <w:r>
+        <w:rPr>
+          <w:color w:val="000000"/>
           <w:lang w:val="da-DK"/>
         </w:rPr>
       </w:r>
@@ -832,26 +863,30 @@
         <w:ind w:left="720" w:hanging="0"/>
         <w:jc w:val="left"/>
         <w:rPr>
-          <w:lang w:val="da-DK"/>
-        </w:rPr>
-      </w:pPr>
-      <w:r>
-        <w:rPr>
-          <w:lang w:val="da-DK"/>
-        </w:rPr>
-      </w:r>
-    </w:p>
-    <w:p>
-      <w:pPr>
-        <w:pStyle w:val="Standard"/>
-        <w:bidi w:val="0"/>
-        <w:jc w:val="left"/>
-        <w:rPr>
-          <w:lang w:val="da-DK"/>
-        </w:rPr>
-      </w:pPr>
-      <w:r>
-        <w:rPr>
+          <w:color w:val="000000"/>
+          <w:lang w:val="da-DK"/>
+        </w:rPr>
+      </w:pPr>
+      <w:r>
+        <w:rPr>
+          <w:color w:val="000000"/>
+          <w:lang w:val="da-DK"/>
+        </w:rPr>
+      </w:r>
+    </w:p>
+    <w:p>
+      <w:pPr>
+        <w:pStyle w:val="Standard"/>
+        <w:bidi w:val="0"/>
+        <w:jc w:val="left"/>
+        <w:rPr>
+          <w:color w:val="000000"/>
+          <w:lang w:val="da-DK"/>
+        </w:rPr>
+      </w:pPr>
+      <w:r>
+        <w:rPr>
+          <w:color w:val="000000"/>
           <w:lang w:val="da-DK"/>
         </w:rPr>
       </w:r>
@@ -864,11 +899,13 @@
         <w:rPr>
           <w:b/>
           <w:b/>
+          <w:color w:val="000000"/>
         </w:rPr>
       </w:pPr>
       <w:r>
         <w:rPr>
           <w:b/>
+          <w:color w:val="000000"/>
         </w:rPr>
       </w:r>
     </w:p>
@@ -882,17 +919,21 @@
         <w:bidi w:val="0"/>
         <w:jc w:val="left"/>
         <w:outlineLvl w:val="0"/>
-        <w:rPr/>
+        <w:rPr>
+          <w:color w:val="000000"/>
+        </w:rPr>
       </w:pPr>
       <w:r>
         <w:rPr>
           <w:b/>
+          <w:color w:val="000000"/>
         </w:rPr>
         <w:t xml:space="preserve">Kendte fejl og mangler i IBOS Nodelæser version </w:t>
       </w:r>
       <w:r>
         <w:rPr>
           <w:b/>
+          <w:color w:val="000000"/>
           <w:lang w:val="da-DK"/>
         </w:rPr>
         <w:t>4</w:t>
@@ -900,12 +941,14 @@
       <w:r>
         <w:rPr>
           <w:b/>
+          <w:color w:val="000000"/>
         </w:rPr>
         <w:t>.</w:t>
       </w:r>
       <w:r>
         <w:rPr>
           <w:b/>
+          <w:color w:val="000000"/>
           <w:lang w:val="da-DK"/>
         </w:rPr>
         <w:t>0.0</w:t>
@@ -913,6 +956,7 @@
       <w:r>
         <w:rPr>
           <w:b/>
+          <w:color w:val="000000"/>
         </w:rPr>
         <w:t>.0</w:t>
       </w:r>
@@ -960,10 +1004,14 @@
         <w:pStyle w:val="Standard"/>
         <w:bidi w:val="0"/>
         <w:jc w:val="left"/>
-        <w:rPr/>
-      </w:pPr>
-      <w:r>
-        <w:rPr/>
+        <w:rPr>
+          <w:color w:val="000000"/>
+        </w:rPr>
+      </w:pPr>
+      <w:r>
+        <w:rPr>
+          <w:color w:val="000000"/>
+        </w:rPr>
       </w:r>
     </w:p>
     <w:p>
@@ -992,12 +1040,12 @@
         <w:bidi w:val="0"/>
         <w:jc w:val="left"/>
         <w:rPr>
-          <w:color w:val="729FCF"/>
-        </w:rPr>
-      </w:pPr>
-      <w:r>
-        <w:rPr>
-          <w:color w:val="729FCF"/>
+          <w:color w:val="000000"/>
+        </w:rPr>
+      </w:pPr>
+      <w:r>
+        <w:rPr>
+          <w:color w:val="000000"/>
         </w:rPr>
       </w:r>
     </w:p>
@@ -1028,13 +1076,13 @@
         <w:bidi w:val="0"/>
         <w:jc w:val="left"/>
         <w:rPr>
-          <w:color w:val="729FCF"/>
-          <w:lang w:val="da-DK"/>
-        </w:rPr>
-      </w:pPr>
-      <w:r>
-        <w:rPr>
-          <w:color w:val="729FCF"/>
+          <w:color w:val="000000"/>
+          <w:lang w:val="da-DK"/>
+        </w:rPr>
+      </w:pPr>
+      <w:r>
+        <w:rPr>
+          <w:color w:val="000000"/>
           <w:lang w:val="da-DK"/>
         </w:rPr>
       </w:r>
@@ -1066,13 +1114,13 @@
         <w:bidi w:val="0"/>
         <w:jc w:val="left"/>
         <w:rPr>
-          <w:color w:val="729FCF"/>
-          <w:lang w:val="da-DK"/>
-        </w:rPr>
-      </w:pPr>
-      <w:r>
-        <w:rPr>
-          <w:color w:val="729FCF"/>
+          <w:color w:val="000000"/>
+          <w:lang w:val="da-DK"/>
+        </w:rPr>
+      </w:pPr>
+      <w:r>
+        <w:rPr>
+          <w:color w:val="000000"/>
           <w:lang w:val="da-DK"/>
         </w:rPr>
       </w:r>
@@ -1104,11 +1152,13 @@
         <w:bidi w:val="0"/>
         <w:jc w:val="left"/>
         <w:rPr>
-          <w:lang w:val="da-DK"/>
-        </w:rPr>
-      </w:pPr>
-      <w:r>
-        <w:rPr>
+          <w:color w:val="000000"/>
+          <w:lang w:val="da-DK"/>
+        </w:rPr>
+      </w:pPr>
+      <w:r>
+        <w:rPr>
+          <w:color w:val="000000"/>
           <w:lang w:val="da-DK"/>
         </w:rPr>
       </w:r>
@@ -1140,11 +1190,13 @@
         <w:bidi w:val="0"/>
         <w:jc w:val="left"/>
         <w:rPr>
-          <w:lang w:val="da-DK"/>
-        </w:rPr>
-      </w:pPr>
-      <w:r>
-        <w:rPr>
+          <w:color w:val="000000"/>
+          <w:lang w:val="da-DK"/>
+        </w:rPr>
+      </w:pPr>
+      <w:r>
+        <w:rPr>
+          <w:color w:val="000000"/>
           <w:lang w:val="da-DK"/>
         </w:rPr>
       </w:r>
@@ -1175,10 +1227,14 @@
         <w:pStyle w:val="Standard"/>
         <w:bidi w:val="0"/>
         <w:jc w:val="left"/>
-        <w:rPr/>
-      </w:pPr>
-      <w:r>
-        <w:rPr/>
+        <w:rPr>
+          <w:color w:val="000000"/>
+        </w:rPr>
+      </w:pPr>
+      <w:r>
+        <w:rPr>
+          <w:color w:val="000000"/>
+        </w:rPr>
       </w:r>
     </w:p>
     <w:sectPr>

</xml_diff>